<commit_message>
Update STEPS PODCAST -  CREATING A WEBSITE WITH DOCKER v1.1.docx
</commit_message>
<xml_diff>
--- a/Steps PodCast/Section1/STEPS PODCAST -  CREATING A WEBSITE WITH DOCKER v1.1.docx
+++ b/Steps PodCast/Section1/STEPS PODCAST -  CREATING A WEBSITE WITH DOCKER v1.1.docx
@@ -3,31 +3,28 @@
 <w:document xmlns:wpc="http://schemas.microsoft.com/office/word/2010/wordprocessingCanvas" xmlns:cx="http://schemas.microsoft.com/office/drawing/2014/chartex" xmlns:cx1="http://schemas.microsoft.com/office/drawing/2015/9/8/chartex" xmlns:cx2="http://schemas.microsoft.com/office/drawing/2015/10/21/chartex" xmlns:cx3="http://schemas.microsoft.com/office/drawing/2016/5/9/chartex" xmlns:cx4="http://schemas.microsoft.com/office/drawing/2016/5/10/chartex" xmlns:cx5="http://schemas.microsoft.com/office/drawing/2016/5/11/chartex" xmlns:cx6="http://schemas.microsoft.com/office/drawing/2016/5/12/chartex" xmlns:cx7="http://schemas.microsoft.com/office/drawing/2016/5/13/chartex" xmlns:cx8="http://schemas.microsoft.com/office/drawing/2016/5/14/chartex" xmlns:mc="http://schemas.openxmlformats.org/markup-compatibility/2006" xmlns:aink="http://schemas.microsoft.com/office/drawing/2016/ink" xmlns:am3d="http://schemas.microsoft.com/office/drawing/2017/model3d" xmlns:o="urn:schemas-microsoft-com:office:office" xmlns:oel="http://schemas.microsoft.com/office/2019/extlst" xmlns:r="http://schemas.openxmlformats.org/officeDocument/2006/relationships" xmlns:m="http://schemas.openxmlformats.org/officeDocument/2006/math" xmlns:v="urn:schemas-microsoft-com:vml" xmlns:wp14="http://schemas.microsoft.com/office/word/2010/wordprocessingDrawing" xmlns:wp="http://schemas.openxmlformats.org/drawingml/2006/wordprocessingDrawing" xmlns:w10="urn:schemas-microsoft-com:office:word" xmlns:w="http://schemas.openxmlformats.org/wordprocessingml/2006/main" xmlns:w14="http://schemas.microsoft.com/office/word/2010/wordml" xmlns:w15="http://schemas.microsoft.com/office/word/2012/wordml" xmlns:w16cex="http://schemas.microsoft.com/office/word/2018/wordml/cex" xmlns:w16cid="http://schemas.microsoft.com/office/word/2016/wordml/cid" xmlns:w16="http://schemas.microsoft.com/office/word/2018/wordml" xmlns:w16du="http://schemas.microsoft.com/office/word/2023/wordml/word16du" xmlns:w16sdtdh="http://schemas.microsoft.com/office/word/2020/wordml/sdtdatahash" xmlns:w16se="http://schemas.microsoft.com/office/word/2015/wordml/symex" xmlns:wpg="http://schemas.microsoft.com/office/word/2010/wordprocessingGroup" xmlns:wpi="http://schemas.microsoft.com/office/word/2010/wordprocessingInk" xmlns:wne="http://schemas.microsoft.com/office/word/2006/wordml" xmlns:wps="http://schemas.microsoft.com/office/word/2010/wordprocessingShape" mc:Ignorable="w14 w15 w16se w16cid w16 w16cex w16sdtdh w16du wp14">
   <w:body>
     <w:p>
+      <w:pPr>
+        <w:rPr>
+          <w:noProof/>
+        </w:rPr>
+      </w:pPr>
       <w:r>
         <w:rPr>
           <w:noProof/>
         </w:rPr>
         <w:drawing>
-          <wp:anchor distT="0" distB="0" distL="114300" distR="114300" simplePos="0" relativeHeight="251658240" behindDoc="1" locked="0" layoutInCell="1" allowOverlap="1" wp14:anchorId="0A54E514" wp14:editId="63FAC68C">
-            <wp:simplePos x="0" y="0"/>
-            <wp:positionH relativeFrom="page">
-              <wp:align>left</wp:align>
-            </wp:positionH>
-            <wp:positionV relativeFrom="paragraph">
-              <wp:posOffset>-903111</wp:posOffset>
-            </wp:positionV>
-            <wp:extent cx="7770685" cy="8285621"/>
-            <wp:effectExtent l="0" t="0" r="1905" b="1270"/>
-            <wp:wrapNone/>
-            <wp:docPr id="1147812954" name="Picture 3" descr="An astronaut in space with planets and stars&#10;&#10;Description automatically generated"/>
+          <wp:inline distT="0" distB="0" distL="0" distR="0" wp14:anchorId="29EC87F4" wp14:editId="0233FD5F">
+            <wp:extent cx="5943600" cy="506730"/>
+            <wp:effectExtent l="0" t="0" r="0" b="7620"/>
+            <wp:docPr id="1743483291" name="Picture 3"/>
             <wp:cNvGraphicFramePr>
-              <a:graphicFrameLocks xmlns:a="http://schemas.openxmlformats.org/drawingml/2006/main"/>
+              <a:graphicFrameLocks xmlns:a="http://schemas.openxmlformats.org/drawingml/2006/main" noChangeAspect="1"/>
             </wp:cNvGraphicFramePr>
             <a:graphic xmlns:a="http://schemas.openxmlformats.org/drawingml/2006/main">
               <a:graphicData uri="http://schemas.openxmlformats.org/drawingml/2006/picture">
                 <pic:pic xmlns:pic="http://schemas.openxmlformats.org/drawingml/2006/picture">
                   <pic:nvPicPr>
-                    <pic:cNvPr id="1147812954" name="Picture 3" descr="An astronaut in space with planets and stars&#10;&#10;Description automatically generated"/>
+                    <pic:cNvPr id="0" name="Picture 1"/>
                     <pic:cNvPicPr>
                       <a:picLocks noChangeAspect="1" noChangeArrowheads="1"/>
                     </pic:cNvPicPr>
@@ -48,7 +45,68 @@
                   <pic:spPr bwMode="auto">
                     <a:xfrm>
                       <a:off x="0" y="0"/>
-                      <a:ext cx="7770685" cy="8285621"/>
+                      <a:ext cx="5943600" cy="506730"/>
+                    </a:xfrm>
+                    <a:prstGeom prst="rect">
+                      <a:avLst/>
+                    </a:prstGeom>
+                    <a:noFill/>
+                    <a:ln>
+                      <a:noFill/>
+                    </a:ln>
+                  </pic:spPr>
+                </pic:pic>
+              </a:graphicData>
+            </a:graphic>
+          </wp:inline>
+        </w:drawing>
+      </w:r>
+      <w:r>
+        <w:rPr>
+          <w:noProof/>
+        </w:rPr>
+        <w:drawing>
+          <wp:anchor distT="0" distB="0" distL="114300" distR="114300" simplePos="0" relativeHeight="251658240" behindDoc="1" locked="0" layoutInCell="1" allowOverlap="1" wp14:anchorId="0A54E514" wp14:editId="494A845D">
+            <wp:simplePos x="0" y="0"/>
+            <wp:positionH relativeFrom="page">
+              <wp:align>right</wp:align>
+            </wp:positionH>
+            <wp:positionV relativeFrom="paragraph">
+              <wp:posOffset>-914400</wp:posOffset>
+            </wp:positionV>
+            <wp:extent cx="7769787" cy="7632645"/>
+            <wp:effectExtent l="0" t="0" r="3175" b="6985"/>
+            <wp:wrapNone/>
+            <wp:docPr id="1147812954" name="Picture 3" descr="An astronaut in space with planets and stars&#10;&#10;Description automatically generated"/>
+            <wp:cNvGraphicFramePr>
+              <a:graphicFrameLocks xmlns:a="http://schemas.openxmlformats.org/drawingml/2006/main"/>
+            </wp:cNvGraphicFramePr>
+            <a:graphic xmlns:a="http://schemas.openxmlformats.org/drawingml/2006/main">
+              <a:graphicData uri="http://schemas.openxmlformats.org/drawingml/2006/picture">
+                <pic:pic xmlns:pic="http://schemas.openxmlformats.org/drawingml/2006/picture">
+                  <pic:nvPicPr>
+                    <pic:cNvPr id="1147812954" name="Picture 3" descr="An astronaut in space with planets and stars&#10;&#10;Description automatically generated"/>
+                    <pic:cNvPicPr>
+                      <a:picLocks noChangeAspect="1" noChangeArrowheads="1"/>
+                    </pic:cNvPicPr>
+                  </pic:nvPicPr>
+                  <pic:blipFill>
+                    <a:blip r:embed="rId10">
+                      <a:extLst>
+                        <a:ext uri="{28A0092B-C50C-407E-A947-70E740481C1C}">
+                          <a14:useLocalDpi xmlns:a14="http://schemas.microsoft.com/office/drawing/2010/main" val="0"/>
+                        </a:ext>
+                      </a:extLst>
+                    </a:blip>
+                    <a:srcRect/>
+                    <a:stretch>
+                      <a:fillRect/>
+                    </a:stretch>
+                  </pic:blipFill>
+                  <pic:spPr bwMode="auto">
+                    <a:xfrm>
+                      <a:off x="0" y="0"/>
+                      <a:ext cx="7769787" cy="7632645"/>
                     </a:xfrm>
                     <a:prstGeom prst="rect">
                       <a:avLst/>
@@ -71,12 +129,13 @@
         </w:drawing>
       </w:r>
     </w:p>
-    <w:p/>
-    <w:p/>
-    <w:p/>
-    <w:p/>
-    <w:p/>
-    <w:p/>
+    <w:p>
+      <w:pPr>
+        <w:rPr>
+          <w:noProof/>
+        </w:rPr>
+      </w:pPr>
+    </w:p>
     <w:p/>
     <w:p/>
     <w:p/>
@@ -95,10 +154,10 @@
           <w:noProof/>
         </w:rPr>
         <w:drawing>
-          <wp:inline distT="0" distB="0" distL="0" distR="0" wp14:anchorId="5A55F87A" wp14:editId="27BD0940">
-            <wp:extent cx="5932909" cy="801511"/>
+          <wp:inline distT="0" distB="0" distL="0" distR="0" wp14:anchorId="198620E3" wp14:editId="36EAEEA8">
+            <wp:extent cx="1391478" cy="1510363"/>
             <wp:effectExtent l="0" t="0" r="0" b="0"/>
-            <wp:docPr id="714133736" name="Picture 6"/>
+            <wp:docPr id="1576921776" name="Picture 4" descr="A yellow line drawing of a hand holding a megaphone&#10;&#10;Description automatically generated"/>
             <wp:cNvGraphicFramePr>
               <a:graphicFrameLocks xmlns:a="http://schemas.openxmlformats.org/drawingml/2006/main" noChangeAspect="1"/>
             </wp:cNvGraphicFramePr>
@@ -106,13 +165,13 @@
               <a:graphicData uri="http://schemas.openxmlformats.org/drawingml/2006/picture">
                 <pic:pic xmlns:pic="http://schemas.openxmlformats.org/drawingml/2006/picture">
                   <pic:nvPicPr>
-                    <pic:cNvPr id="0" name="Picture 7"/>
+                    <pic:cNvPr id="1576921776" name="Picture 4" descr="A yellow line drawing of a hand holding a megaphone&#10;&#10;Description automatically generated"/>
                     <pic:cNvPicPr>
                       <a:picLocks noChangeAspect="1" noChangeArrowheads="1"/>
                     </pic:cNvPicPr>
                   </pic:nvPicPr>
                   <pic:blipFill>
-                    <a:blip r:embed="rId10">
+                    <a:blip r:embed="rId11">
                       <a:extLst>
                         <a:ext uri="{28A0092B-C50C-407E-A947-70E740481C1C}">
                           <a14:useLocalDpi xmlns:a14="http://schemas.microsoft.com/office/drawing/2010/main" val="0"/>
@@ -127,7 +186,7 @@
                   <pic:spPr bwMode="auto">
                     <a:xfrm>
                       <a:off x="0" y="0"/>
-                      <a:ext cx="6044716" cy="816616"/>
+                      <a:ext cx="1403125" cy="1523005"/>
                     </a:xfrm>
                     <a:prstGeom prst="rect">
                       <a:avLst/>
@@ -153,15 +212,15 @@
         <mc:AlternateContent>
           <mc:Choice Requires="wps">
             <w:drawing>
-              <wp:anchor distT="0" distB="0" distL="114300" distR="114300" simplePos="0" relativeHeight="251659264" behindDoc="0" locked="0" layoutInCell="1" allowOverlap="1" wp14:anchorId="6E30FCCA" wp14:editId="794D2E66">
+              <wp:anchor distT="0" distB="0" distL="114300" distR="114300" simplePos="0" relativeHeight="251659264" behindDoc="0" locked="0" layoutInCell="1" allowOverlap="1" wp14:anchorId="6E30FCCA" wp14:editId="35F37ECE">
                 <wp:simplePos x="0" y="0"/>
-                <wp:positionH relativeFrom="column">
-                  <wp:posOffset>-891822</wp:posOffset>
+                <wp:positionH relativeFrom="page">
+                  <wp:align>right</wp:align>
                 </wp:positionH>
                 <wp:positionV relativeFrom="paragraph">
-                  <wp:posOffset>167427</wp:posOffset>
+                  <wp:posOffset>351238</wp:posOffset>
                 </wp:positionV>
-                <wp:extent cx="7747917" cy="1738489"/>
+                <wp:extent cx="7747635" cy="1737995"/>
                 <wp:effectExtent l="0" t="0" r="24765" b="14605"/>
                 <wp:wrapNone/>
                 <wp:docPr id="1074075107" name="Rectangle 5"/>
@@ -173,7 +232,7 @@
                       <wps:spPr>
                         <a:xfrm>
                           <a:off x="0" y="0"/>
-                          <a:ext cx="7747917" cy="1738489"/>
+                          <a:ext cx="7747635" cy="1737995"/>
                         </a:xfrm>
                         <a:prstGeom prst="rect">
                           <a:avLst/>
@@ -301,7 +360,7 @@
           </mc:Choice>
           <mc:Fallback>
             <w:pict>
-              <v:rect w14:anchorId="6E30FCCA" id="Rectangle 5" o:spid="_x0000_s1026" style="position:absolute;margin-left:-70.2pt;margin-top:13.2pt;width:610.05pt;height:136.9pt;z-index:251659264;visibility:visible;mso-wrap-style:square;mso-width-percent:0;mso-height-percent:0;mso-wrap-distance-left:9pt;mso-wrap-distance-top:0;mso-wrap-distance-right:9pt;mso-wrap-distance-bottom:0;mso-position-horizontal:absolute;mso-position-horizontal-relative:text;mso-position-vertical:absolute;mso-position-vertical-relative:text;mso-width-percent:0;mso-height-percent:0;mso-width-relative:margin;mso-height-relative:margin;v-text-anchor:middle" o:gfxdata="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" fillcolor="#156082 [3204]" strokecolor="#030e13 [484]" strokeweight="1pt">
+              <v:rect w14:anchorId="6E30FCCA" id="Rectangle 5" o:spid="_x0000_s1026" style="position:absolute;margin-left:558.85pt;margin-top:27.65pt;width:610.05pt;height:136.85pt;z-index:251659264;visibility:visible;mso-wrap-style:square;mso-width-percent:0;mso-height-percent:0;mso-wrap-distance-left:9pt;mso-wrap-distance-top:0;mso-wrap-distance-right:9pt;mso-wrap-distance-bottom:0;mso-position-horizontal:right;mso-position-horizontal-relative:page;mso-position-vertical:absolute;mso-position-vertical-relative:text;mso-width-percent:0;mso-height-percent:0;mso-width-relative:margin;mso-height-relative:margin;v-text-anchor:middle" o:gfxdata="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" fillcolor="#156082 [3204]" strokecolor="#030e13 [484]" strokeweight="1pt">
                 <v:textbox>
                   <w:txbxContent>
                     <w:p>
@@ -388,6 +447,7 @@
                     </w:p>
                   </w:txbxContent>
                 </v:textbox>
+                <w10:wrap anchorx="page"/>
               </v:rect>
             </w:pict>
           </mc:Fallback>
@@ -396,8 +456,23 @@
     </w:p>
     <w:p/>
     <w:p/>
+    <w:p/>
+    <w:p/>
+    <w:p/>
+    <w:p/>
+    <w:p/>
+    <w:p/>
+    <w:p/>
     <w:sdt>
       <w:sdtPr>
+        <w:rPr>
+          <w:rFonts w:asciiTheme="minorHAnsi" w:eastAsiaTheme="minorHAnsi" w:hAnsiTheme="minorHAnsi" w:cstheme="minorBidi"/>
+          <w:color w:val="auto"/>
+          <w:kern w:val="2"/>
+          <w:sz w:val="24"/>
+          <w:szCs w:val="24"/>
+          <w14:ligatures w14:val="standardContextual"/>
+        </w:rPr>
         <w:id w:val="-1370765718"/>
         <w:docPartObj>
           <w:docPartGallery w:val="Table of Contents"/>
@@ -406,15 +481,9 @@
       </w:sdtPr>
       <w:sdtEndPr>
         <w:rPr>
-          <w:rFonts w:asciiTheme="minorHAnsi" w:eastAsiaTheme="minorHAnsi" w:hAnsiTheme="minorHAnsi" w:cstheme="minorBidi"/>
           <w:b/>
           <w:bCs/>
           <w:noProof/>
-          <w:color w:val="auto"/>
-          <w:kern w:val="2"/>
-          <w:sz w:val="24"/>
-          <w:szCs w:val="24"/>
-          <w14:ligatures w14:val="standardContextual"/>
         </w:rPr>
       </w:sdtEndPr>
       <w:sdtContent>
@@ -1021,7 +1090,6 @@
       <w:bookmarkStart w:id="0" w:name="_Toc183807700"/>
       <w:bookmarkStart w:id="1" w:name="_Toc183886486"/>
       <w:r>
-        <w:lastRenderedPageBreak/>
         <w:t>Installed Software</w:t>
       </w:r>
       <w:bookmarkEnd w:id="0"/>
@@ -1102,7 +1170,7 @@
                     <pic:cNvPicPr/>
                   </pic:nvPicPr>
                   <pic:blipFill>
-                    <a:blip r:embed="rId11"/>
+                    <a:blip r:embed="rId12"/>
                     <a:stretch>
                       <a:fillRect/>
                     </a:stretch>
@@ -1191,7 +1259,7 @@
       <w:pPr>
         <w:jc w:val="center"/>
       </w:pPr>
-      <w:hyperlink r:id="rId12" w:history="1">
+      <w:hyperlink r:id="rId13" w:history="1">
         <w:r>
           <w:rPr>
             <w:rStyle w:val="Hyperlink"/>
@@ -1207,7 +1275,6 @@
       <w:bookmarkStart w:id="6" w:name="_Toc183807703"/>
       <w:bookmarkStart w:id="7" w:name="_Toc183886489"/>
       <w:r>
-        <w:lastRenderedPageBreak/>
         <w:t>Source Tree</w:t>
       </w:r>
       <w:bookmarkEnd w:id="6"/>
@@ -1237,7 +1304,7 @@
                     <pic:cNvPicPr/>
                   </pic:nvPicPr>
                   <pic:blipFill>
-                    <a:blip r:embed="rId13"/>
+                    <a:blip r:embed="rId14"/>
                     <a:stretch>
                       <a:fillRect/>
                     </a:stretch>
@@ -1284,7 +1351,7 @@
       <w:pPr>
         <w:jc w:val="center"/>
       </w:pPr>
-      <w:hyperlink r:id="rId14" w:history="1">
+      <w:hyperlink r:id="rId15" w:history="1">
         <w:r>
           <w:rPr>
             <w:rStyle w:val="Hyperlink"/>
@@ -1329,7 +1396,7 @@
                     <pic:cNvPicPr/>
                   </pic:nvPicPr>
                   <pic:blipFill>
-                    <a:blip r:embed="rId15"/>
+                    <a:blip r:embed="rId16"/>
                     <a:stretch>
                       <a:fillRect/>
                     </a:stretch>
@@ -1379,7 +1446,7 @@
           <w:rStyle w:val="Hyperlink"/>
         </w:rPr>
       </w:pPr>
-      <w:hyperlink r:id="rId16" w:history="1">
+      <w:hyperlink r:id="rId17" w:history="1">
         <w:r>
           <w:rPr>
             <w:rStyle w:val="Hyperlink"/>
@@ -1425,7 +1492,7 @@
                     <pic:cNvPicPr/>
                   </pic:nvPicPr>
                   <pic:blipFill>
-                    <a:blip r:embed="rId17"/>
+                    <a:blip r:embed="rId18"/>
                     <a:stretch>
                       <a:fillRect/>
                     </a:stretch>
@@ -1493,7 +1560,7 @@
           <w:rStyle w:val="Hyperlink"/>
         </w:rPr>
       </w:pPr>
-      <w:hyperlink r:id="rId18" w:history="1">
+      <w:hyperlink r:id="rId19" w:history="1">
         <w:r>
           <w:rPr>
             <w:rStyle w:val="Hyperlink"/>
@@ -1555,7 +1622,7 @@
                     <pic:cNvPicPr/>
                   </pic:nvPicPr>
                   <pic:blipFill>
-                    <a:blip r:embed="rId19"/>
+                    <a:blip r:embed="rId20"/>
                     <a:stretch>
                       <a:fillRect/>
                     </a:stretch>
@@ -1591,7 +1658,7 @@
           <w:rStyle w:val="Hyperlink"/>
         </w:rPr>
       </w:pPr>
-      <w:hyperlink r:id="rId20" w:history="1">
+      <w:hyperlink r:id="rId21" w:history="1">
         <w:r>
           <w:rPr>
             <w:rStyle w:val="Hyperlink"/>
@@ -1651,7 +1718,7 @@
                     <pic:cNvPicPr/>
                   </pic:nvPicPr>
                   <pic:blipFill>
-                    <a:blip r:embed="rId21"/>
+                    <a:blip r:embed="rId22"/>
                     <a:stretch>
                       <a:fillRect/>
                     </a:stretch>
@@ -1696,7 +1763,7 @@
           <w:u w:val="single"/>
         </w:rPr>
       </w:pPr>
-      <w:hyperlink r:id="rId22" w:history="1">
+      <w:hyperlink r:id="rId23" w:history="1">
         <w:r>
           <w:rPr>
             <w:rStyle w:val="Hyperlink"/>
@@ -1734,8 +1801,8 @@
     <w:p/>
     <w:p/>
     <w:sectPr>
-      <w:headerReference w:type="default" r:id="rId23"/>
-      <w:footerReference w:type="default" r:id="rId24"/>
+      <w:headerReference w:type="default" r:id="rId24"/>
+      <w:footerReference w:type="default" r:id="rId25"/>
       <w:pgSz w:w="12240" w:h="15840"/>
       <w:pgMar w:top="1440" w:right="1440" w:bottom="1440" w:left="1440" w:header="720" w:footer="720" w:gutter="0"/>
       <w:pgNumType w:start="0"/>

</xml_diff>